<commit_message>
update to index and doc corrections
</commit_message>
<xml_diff>
--- a/source/data/Summary and ask - T1 readmes.docx
+++ b/source/data/Summary and ask - T1 readmes.docx
@@ -4,8 +4,45 @@
   <w:body>
     <w:p>
       <w:pPr>
+        <w:pStyle w:val="Heading1"/>
+      </w:pPr>
+      <w:r>
+        <w:rPr>
+          <w:rStyle w:val="Heading1Char"/>
+        </w:rPr>
+        <w:t>Demo</w:t>
+      </w:r>
+      <w:r>
+        <w:rPr>
+          <w:rStyle w:val="Heading1Char"/>
+        </w:rPr>
+        <w:t xml:space="preserve"> summary</w:t>
+      </w:r>
+      <w:r>
+        <w:rPr>
+          <w:rStyle w:val="Heading1Char"/>
+        </w:rPr>
+        <w:t xml:space="preserve"> and discussion topics</w:t>
+      </w:r>
+      <w:r>
+        <w:t xml:space="preserve"> (June 29, </w:t>
+      </w:r>
+      <w:proofErr w:type="gramStart"/>
+      <w:r>
+        <w:t>2026</w:t>
+      </w:r>
+      <w:proofErr w:type="gramEnd"/>
+      <w:r>
+        <w:t xml:space="preserve"> meeting)</w:t>
+      </w:r>
+    </w:p>
+    <w:p>
+      <w:pPr>
         <w:pStyle w:val="Heading2"/>
       </w:pPr>
+      <w:r>
+        <w:br/>
+      </w:r>
       <w:r>
         <w:t>Summary of the demo</w:t>
       </w:r>
@@ -43,10 +80,7 @@
         <w:t>n the package pages</w:t>
       </w:r>
       <w:r>
-        <w:t>, o</w:t>
-      </w:r>
-      <w:r>
-        <w:t>nly links are updated</w:t>
+        <w:t>, only links are updated</w:t>
       </w:r>
     </w:p>
     <w:p>
@@ -82,7 +116,10 @@
         </w:numPr>
       </w:pPr>
       <w:r>
-        <w:t>Currenly o</w:t>
+        <w:t>Currently</w:t>
+      </w:r>
+      <w:r>
+        <w:t xml:space="preserve"> o</w:t>
       </w:r>
       <w:r>
         <w:t>ld guides will not be updated</w:t>
@@ -133,7 +170,15 @@
         </w:numPr>
       </w:pPr>
       <w:r>
-        <w:t>When the user come to the forms readme from a prior year package</w:t>
+        <w:t xml:space="preserve">When the user come to the </w:t>
+      </w:r>
+      <w:proofErr w:type="gramStart"/>
+      <w:r>
+        <w:t>forms</w:t>
+      </w:r>
+      <w:proofErr w:type="gramEnd"/>
+      <w:r>
+        <w:t xml:space="preserve"> readme from a prior year package</w:t>
       </w:r>
       <w:r>
         <w:t>:</w:t>
@@ -157,18 +202,36 @@
         <w:t xml:space="preserve"> to their year</w:t>
       </w:r>
       <w:r>
-        <w:t xml:space="preserve"> (uses a URL parameter such as</w:t>
-      </w:r>
-      <w:r>
-        <w:t xml:space="preserve"> </w:t>
+        <w:t xml:space="preserve"> (uses a URL parameter such </w:t>
+      </w:r>
+      <w:proofErr w:type="gramStart"/>
+      <w:r>
+        <w:t xml:space="preserve">as </w:t>
       </w:r>
       <w:r>
         <w:rPr>
           <w:b/>
           <w:bCs/>
         </w:rPr>
-        <w:t>?yr=2018&amp;rgn=mb#prvs-yrs</w:t>
-      </w:r>
+        <w:t>?yr</w:t>
+      </w:r>
+      <w:proofErr w:type="gramEnd"/>
+      <w:r>
+        <w:rPr>
+          <w:b/>
+          <w:bCs/>
+        </w:rPr>
+        <w:t>=2018&amp;rgn=</w:t>
+      </w:r>
+      <w:proofErr w:type="spellStart"/>
+      <w:r>
+        <w:rPr>
+          <w:b/>
+          <w:bCs/>
+        </w:rPr>
+        <w:t>mb#prvs-yrs</w:t>
+      </w:r>
+      <w:proofErr w:type="spellEnd"/>
       <w:r>
         <w:t>)</w:t>
       </w:r>
@@ -209,10 +272,10 @@
         <w:t xml:space="preserve">They will </w:t>
       </w:r>
       <w:r>
-        <w:t>be archichec</w:t>
-      </w:r>
-      <w:r>
-        <w:t>ted</w:t>
+        <w:t xml:space="preserve">be </w:t>
+      </w:r>
+      <w:r>
+        <w:t>architected</w:t>
       </w:r>
       <w:r>
         <w:t xml:space="preserve"> under </w:t>
@@ -222,13 +285,7 @@
           <w:rPr>
             <w:rStyle w:val="Hyperlink"/>
           </w:rPr>
-          <w:t xml:space="preserve">CRA </w:t>
-        </w:r>
-        <w:r>
-          <w:rPr>
-            <w:rStyle w:val="Hyperlink"/>
-          </w:rPr>
-          <w:t>forms listed by number</w:t>
+          <w:t>CRA forms listed by number</w:t>
         </w:r>
       </w:hyperlink>
     </w:p>
@@ -329,13 +386,7 @@
         <w:t>approval</w:t>
       </w:r>
       <w:r>
-        <w:t xml:space="preserve"> to change the H1s of the forms listing page as follows</w:t>
-      </w:r>
-      <w:r>
-        <w:t xml:space="preserve"> </w:t>
-      </w:r>
-      <w:r>
-        <w:t xml:space="preserve">(for cleaner and more consistent H1s and </w:t>
+        <w:t xml:space="preserve"> to change the H1s of the forms listing page as follows (for cleaner and more consistent H1s and </w:t>
       </w:r>
       <w:r>
         <w:t>breadcrumbs</w:t>
@@ -360,7 +411,16 @@
             <w:strike/>
             <w:color w:val="EE0000"/>
           </w:rPr>
-          <w:t>Canada Revenue Agency</w:t>
+          <w:t xml:space="preserve">Canada Revenue </w:t>
+        </w:r>
+        <w:proofErr w:type="spellStart"/>
+        <w:r>
+          <w:rPr>
+            <w:rStyle w:val="Hyperlink"/>
+            <w:strike/>
+            <w:color w:val="EE0000"/>
+          </w:rPr>
+          <w:t>Agency</w:t>
         </w:r>
         <w:r>
           <w:rPr>
@@ -369,6 +429,7 @@
           </w:rPr>
           <w:t>CRA</w:t>
         </w:r>
+        <w:proofErr w:type="spellEnd"/>
         <w:r>
           <w:rPr>
             <w:rStyle w:val="Hyperlink"/>
@@ -404,7 +465,17 @@
             <w:color w:val="EE0000"/>
             <w:lang w:val="fr-FR"/>
           </w:rPr>
-          <w:t>Agence du revenu du Canada</w:t>
+          <w:t xml:space="preserve">Agence du revenu du </w:t>
+        </w:r>
+        <w:proofErr w:type="spellStart"/>
+        <w:r>
+          <w:rPr>
+            <w:rStyle w:val="Hyperlink"/>
+            <w:strike/>
+            <w:color w:val="EE0000"/>
+            <w:lang w:val="fr-FR"/>
+          </w:rPr>
+          <w:t>Canada</w:t>
         </w:r>
         <w:r>
           <w:rPr>
@@ -414,6 +485,7 @@
           </w:rPr>
           <w:t>ARC</w:t>
         </w:r>
+        <w:proofErr w:type="spellEnd"/>
         <w:r>
           <w:rPr>
             <w:rStyle w:val="Hyperlink"/>
@@ -594,6 +666,7 @@
         </w:numPr>
       </w:pPr>
       <w:r>
+        <w:lastRenderedPageBreak/>
         <w:t xml:space="preserve">Provide </w:t>
       </w:r>
       <w:r>
@@ -741,8 +814,15 @@
         </w:numPr>
       </w:pPr>
       <w:r>
-        <w:lastRenderedPageBreak/>
-        <w:t>I recommend these link be change to the “</w:t>
+        <w:t xml:space="preserve">I recommend </w:t>
+      </w:r>
+      <w:proofErr w:type="gramStart"/>
+      <w:r>
+        <w:t>these link</w:t>
+      </w:r>
+      <w:proofErr w:type="gramEnd"/>
+      <w:r>
+        <w:t xml:space="preserve"> be change to the “</w:t>
       </w:r>
       <w:r>
         <w:t>Get another format or a previous year version</w:t>
@@ -804,13 +884,21 @@
         <w:t>be updated again until they are phased out. The destination tables will be updated each year.</w:t>
       </w:r>
       <w:r>
-        <w:t xml:space="preserve"> (Not mocked</w:t>
+        <w:t xml:space="preserve"> (Not </w:t>
+      </w:r>
+      <w:proofErr w:type="gramStart"/>
+      <w:r>
+        <w:t>mocked</w:t>
       </w:r>
       <w:r>
         <w:t>-</w:t>
       </w:r>
       <w:r>
-        <w:t>up)</w:t>
+        <w:t>up</w:t>
+      </w:r>
+      <w:proofErr w:type="gramEnd"/>
+      <w:r>
+        <w:t>)</w:t>
       </w:r>
     </w:p>
     <w:p>
@@ -835,10 +923,13 @@
         <w:t>(to be discussed)</w:t>
       </w:r>
       <w:r>
-        <w:t>. I believe provincial forms are clear enough and do not need these details</w:t>
-      </w:r>
-      <w:r>
-        <w:t>, but correct me if they are not</w:t>
+        <w:t xml:space="preserve">. I believe provincial forms are clear enough and do not need these </w:t>
+      </w:r>
+      <w:r>
+        <w:t>details… but</w:t>
+      </w:r>
+      <w:r>
+        <w:t xml:space="preserve"> correct me if they are not</w:t>
       </w:r>
       <w:r>
         <w:t>.</w:t>
@@ -873,8 +964,13 @@
       <w:r>
         <w:t>(</w:t>
       </w:r>
-      <w:r>
-        <w:t>eg: 5000-S7)</w:t>
+      <w:proofErr w:type="spellStart"/>
+      <w:r>
+        <w:t>eg</w:t>
+      </w:r>
+      <w:proofErr w:type="spellEnd"/>
+      <w:r>
+        <w:t>: 5000-S7)</w:t>
       </w:r>
     </w:p>
     <w:p>
@@ -911,7 +1007,15 @@
         <w:ind w:left="720"/>
       </w:pPr>
       <w:r>
-        <w:t>(pour tous)</w:t>
+        <w:t xml:space="preserve">(pour </w:t>
+      </w:r>
+      <w:proofErr w:type="spellStart"/>
+      <w:r>
+        <w:t>tous</w:t>
+      </w:r>
+      <w:proofErr w:type="spellEnd"/>
+      <w:r>
+        <w:t>)</w:t>
       </w:r>
     </w:p>
     <w:p>
@@ -928,7 +1032,23 @@
           <w:b/>
           <w:bCs/>
         </w:rPr>
-        <w:t>When it is for all, but with exceptions (eg: 5000-S2)</w:t>
+        <w:t>When it is for all, but with exceptions (</w:t>
+      </w:r>
+      <w:proofErr w:type="spellStart"/>
+      <w:r>
+        <w:rPr>
+          <w:b/>
+          <w:bCs/>
+        </w:rPr>
+        <w:t>eg</w:t>
+      </w:r>
+      <w:proofErr w:type="spellEnd"/>
+      <w:r>
+        <w:rPr>
+          <w:b/>
+          <w:bCs/>
+        </w:rPr>
+        <w:t>: 5000-S2)</w:t>
       </w:r>
     </w:p>
     <w:p>
@@ -960,7 +1080,21 @@
         <w:rPr>
           <w:lang w:val="fr-CA"/>
         </w:rPr>
-        <w:t>(pour tous sauf QC et non-résidents)</w:t>
+        <w:t>(</w:t>
+      </w:r>
+      <w:proofErr w:type="gramStart"/>
+      <w:r>
+        <w:rPr>
+          <w:lang w:val="fr-CA"/>
+        </w:rPr>
+        <w:t>pour</w:t>
+      </w:r>
+      <w:proofErr w:type="gramEnd"/>
+      <w:r>
+        <w:rPr>
+          <w:lang w:val="fr-CA"/>
+        </w:rPr>
+        <w:t xml:space="preserve"> tous sauf QC et non-résidents)</w:t>
       </w:r>
     </w:p>
     <w:p>
@@ -980,7 +1114,23 @@
           <w:b/>
           <w:bCs/>
         </w:rPr>
-        <w:t>year (eg: 5000-R)</w:t>
+        <w:t>year (</w:t>
+      </w:r>
+      <w:proofErr w:type="spellStart"/>
+      <w:r>
+        <w:rPr>
+          <w:b/>
+          <w:bCs/>
+        </w:rPr>
+        <w:t>eg</w:t>
+      </w:r>
+      <w:proofErr w:type="spellEnd"/>
+      <w:r>
+        <w:rPr>
+          <w:b/>
+          <w:bCs/>
+        </w:rPr>
+        <w:t>: 5000-R)</w:t>
       </w:r>
     </w:p>
     <w:p>
@@ -1012,7 +1162,21 @@
         <w:rPr>
           <w:lang w:val="fr-CA"/>
         </w:rPr>
-        <w:t>(pour plusieurs provinces et territoires)</w:t>
+        <w:t>(</w:t>
+      </w:r>
+      <w:proofErr w:type="gramStart"/>
+      <w:r>
+        <w:rPr>
+          <w:lang w:val="fr-CA"/>
+        </w:rPr>
+        <w:t>pour</w:t>
+      </w:r>
+      <w:proofErr w:type="gramEnd"/>
+      <w:r>
+        <w:rPr>
+          <w:lang w:val="fr-CA"/>
+        </w:rPr>
+        <w:t xml:space="preserve"> plusieurs provinces et territoires)</w:t>
       </w:r>
     </w:p>
     <w:p>
@@ -1032,7 +1196,23 @@
           <w:b/>
           <w:bCs/>
         </w:rPr>
-        <w:t>only (eg: 5009-R)</w:t>
+        <w:t>only (</w:t>
+      </w:r>
+      <w:proofErr w:type="spellStart"/>
+      <w:r>
+        <w:rPr>
+          <w:b/>
+          <w:bCs/>
+        </w:rPr>
+        <w:t>eg</w:t>
+      </w:r>
+      <w:proofErr w:type="spellEnd"/>
+      <w:r>
+        <w:rPr>
+          <w:b/>
+          <w:bCs/>
+        </w:rPr>
+        <w:t>: 5009-R)</w:t>
       </w:r>
     </w:p>
     <w:p>
@@ -1087,22 +1267,33 @@
         </w:numPr>
       </w:pPr>
       <w:r>
-        <w:t xml:space="preserve">The uniqueness of the H1 is more important, so </w:t>
-      </w:r>
-      <w:r>
-        <w:t xml:space="preserve"> some exceptions might be warranted</w:t>
+        <w:t xml:space="preserve">The uniqueness of the H1 is more important, </w:t>
+      </w:r>
+      <w:r>
+        <w:t>so some</w:t>
+      </w:r>
+      <w:r>
+        <w:t xml:space="preserve"> exceptions might be warranted</w:t>
       </w:r>
       <w:r>
         <w:rPr>
           <w:highlight w:val="yellow"/>
         </w:rPr>
-        <w:t xml:space="preserve"> </w:t>
-      </w:r>
+        <w:t xml:space="preserve"> (</w:t>
+      </w:r>
+      <w:proofErr w:type="spellStart"/>
       <w:r>
         <w:rPr>
           <w:highlight w:val="yellow"/>
         </w:rPr>
-        <w:t>(eg: 5000-R and 5015-R</w:t>
+        <w:t>eg</w:t>
+      </w:r>
+      <w:proofErr w:type="spellEnd"/>
+      <w:r>
+        <w:rPr>
+          <w:highlight w:val="yellow"/>
+        </w:rPr>
+        <w:t>: 5000-R and 5015-R</w:t>
       </w:r>
       <w:r>
         <w:rPr>
@@ -3483,6 +3674,7 @@
   <w:style w:type="character" w:default="1" w:styleId="DefaultParagraphFont">
     <w:name w:val="Default Paragraph Font"/>
     <w:uiPriority w:val="1"/>
+    <w:semiHidden/>
     <w:unhideWhenUsed/>
   </w:style>
   <w:style w:type="table" w:default="1" w:styleId="TableNormal">

</xml_diff>